<commit_message>
docs: update biography credentials, contact channels, and comprehensive system architecture docs
</commit_message>
<xml_diff>
--- a/Documents/Biography.docx
+++ b/Documents/Biography.docx
@@ -1,6 +1,6 @@
 
 <file path=word/document.xml><?xml version="1.0" encoding="utf-8"?>
-<w:document xmlns:wpc="http://schemas.microsoft.com/office/word/2010/wordprocessingCanvas" xmlns:cx="http://schemas.microsoft.com/office/drawing/2014/chartex" xmlns:cx1="http://schemas.microsoft.com/office/drawing/2015/9/8/chartex" xmlns:cx2="http://schemas.microsoft.com/office/drawing/2015/10/21/chartex" xmlns:cx3="http://schemas.microsoft.com/office/drawing/2016/5/9/chartex" xmlns:cx4="http://schemas.microsoft.com/office/drawing/2016/5/10/chartex" xmlns:cx5="http://schemas.microsoft.com/office/drawing/2016/5/11/chartex" xmlns:cx6="http://schemas.microsoft.com/office/drawing/2016/5/12/chartex" xmlns:cx7="http://schemas.microsoft.com/office/drawing/2016/5/13/chartex" xmlns:cx8="http://schemas.microsoft.com/office/drawing/2016/5/14/chartex" xmlns:mc="http://schemas.openxmlformats.org/markup-compatibility/2006" xmlns:aink="http://schemas.microsoft.com/office/drawing/2016/ink" xmlns:am3d="http://schemas.microsoft.com/office/drawing/2017/model3d" xmlns:o="urn:schemas-microsoft-com:office:office" xmlns:oel="http://schemas.microsoft.com/office/2019/extlst" xmlns:r="http://schemas.openxmlformats.org/officeDocument/2006/relationships" xmlns:m="http://schemas.openxmlformats.org/officeDocument/2006/math" xmlns:v="urn:schemas-microsoft-com:vml" xmlns:wp14="http://schemas.microsoft.com/office/word/2010/wordprocessingDrawing" xmlns:wp="http://schemas.openxmlformats.org/drawingml/2006/wordprocessingDrawing" xmlns:w10="urn:schemas-microsoft-com:office:word" xmlns:w="http://schemas.openxmlformats.org/wordprocessingml/2006/main" xmlns:w14="http://schemas.microsoft.com/office/word/2010/wordml" xmlns:w15="http://schemas.microsoft.com/office/word/2012/wordml" xmlns:w16cex="http://schemas.microsoft.com/office/word/2018/wordml/cex" xmlns:w16cid="http://schemas.microsoft.com/office/word/2016/wordml/cid" xmlns:w16="http://schemas.microsoft.com/office/word/2018/wordml" xmlns:w16du="http://schemas.microsoft.com/office/word/2023/wordml/word16du" xmlns:w16sdtdh="http://schemas.microsoft.com/office/word/2020/wordml/sdtdatahash" xmlns:w16sdtfl="http://schemas.microsoft.com/office/word/2024/wordml/sdtformatlock" xmlns:w16se="http://schemas.microsoft.com/office/word/2015/wordml/symex" xmlns:wpg="http://schemas.microsoft.com/office/word/2010/wordprocessingGroup" xmlns:wpi="http://schemas.microsoft.com/office/word/2010/wordprocessingInk" xmlns:wne="http://schemas.microsoft.com/office/word/2006/wordml" xmlns:wps="http://schemas.microsoft.com/office/word/2010/wordprocessingShape" mc:Ignorable="w14 w15 w16se w16cid w16 w16cex w16sdtdh w16sdtfl w16du wp14">
+<w:document xmlns:ns1="http://schemas.openxmlformats.org/markup-compatibility/2006" xmlns:ns2="http://schemas.microsoft.com/office/word/2010/wordml" xmlns:ns3="http://schemas.openxmlformats.org/drawingml/2006/wordprocessingDrawing" xmlns:ns4="http://schemas.microsoft.com/office/word/2010/wordprocessingDrawing" xmlns:ns5="http://schemas.openxmlformats.org/drawingml/2006/main" xmlns:ns6="http://schemas.openxmlformats.org/drawingml/2006/picture" xmlns:ns7="http://schemas.openxmlformats.org/officeDocument/2006/relationships" xmlns:ns8="http://schemas.microsoft.com/office/drawing/2010/main" xmlns:w="http://schemas.openxmlformats.org/wordprocessingml/2006/main" ns1:Ignorable="w14 w15 w16se w16cid w16 w16cex w16sdtdh w16sdtfl w16du wp14">
   <w:body>
     <w:tbl>
       <w:tblPr>
@@ -12,7 +12,7 @@
         <w:gridCol w:w="2106"/>
         <w:gridCol w:w="8576"/>
       </w:tblGrid>
-      <w:tr>
+      <w:tr ns2:paraId="34F6E608" ns2:textId="77777777">
         <w:trPr>
           <w:jc w:val="center"/>
         </w:trPr>
@@ -20,77 +20,77 @@
           <w:tcPr>
             <w:tcW w:w="3456" w:type="dxa"/>
           </w:tcPr>
-          <w:p>
+          <w:p ns2:paraId="4ABC1B10" ns2:textId="555E77B5">
             <w:r>
               <w:rPr>
                 <w:noProof/>
               </w:rPr>
               <w:drawing>
-                <wp:anchor distT="0" distB="0" distL="114300" distR="114300" simplePos="0" relativeHeight="251660800" behindDoc="0" locked="0" layoutInCell="1" allowOverlap="1" wp14:anchorId="29B5D335" wp14:editId="2E64544F">
-                  <wp:simplePos x="0" y="0"/>
-                  <wp:positionH relativeFrom="column">
-                    <wp:posOffset>0</wp:posOffset>
-                  </wp:positionH>
-                  <wp:positionV relativeFrom="paragraph">
-                    <wp:posOffset>116006</wp:posOffset>
-                  </wp:positionV>
-                  <wp:extent cx="1201003" cy="1201003"/>
-                  <wp:effectExtent l="0" t="0" r="0" b="0"/>
-                  <wp:wrapNone/>
-                  <wp:docPr id="2020212982" name="Picture 1"/>
-                  <wp:cNvGraphicFramePr>
-                    <a:graphicFrameLocks xmlns:a="http://schemas.openxmlformats.org/drawingml/2006/main" noChangeAspect="1"/>
-                  </wp:cNvGraphicFramePr>
-                  <a:graphic xmlns:a="http://schemas.openxmlformats.org/drawingml/2006/main">
-                    <a:graphicData uri="http://schemas.openxmlformats.org/drawingml/2006/picture">
-                      <pic:pic xmlns:pic="http://schemas.openxmlformats.org/drawingml/2006/picture">
-                        <pic:nvPicPr>
-                          <pic:cNvPr id="0" name="Picture 1"/>
-                          <pic:cNvPicPr>
-                            <a:picLocks noChangeAspect="1" noChangeArrowheads="1"/>
-                          </pic:cNvPicPr>
-                        </pic:nvPicPr>
-                        <pic:blipFill>
-                          <a:blip r:embed="rId6">
-                            <a:extLst>
-                              <a:ext uri="{28A0092B-C50C-407E-A947-70E740481C1C}">
-                                <a14:useLocalDpi xmlns:a14="http://schemas.microsoft.com/office/drawing/2010/main" val="0"/>
-                              </a:ext>
-                            </a:extLst>
-                          </a:blip>
-                          <a:srcRect/>
-                          <a:stretch>
-                            <a:fillRect/>
-                          </a:stretch>
-                        </pic:blipFill>
-                        <pic:spPr bwMode="auto">
-                          <a:xfrm>
-                            <a:off x="0" y="0"/>
-                            <a:ext cx="1203370" cy="1203370"/>
-                          </a:xfrm>
-                          <a:prstGeom prst="rect">
-                            <a:avLst/>
-                          </a:prstGeom>
-                          <a:noFill/>
-                          <a:ln>
-                            <a:noFill/>
-                          </a:ln>
-                        </pic:spPr>
-                      </pic:pic>
-                    </a:graphicData>
-                  </a:graphic>
-                  <wp14:sizeRelH relativeFrom="page">
-                    <wp14:pctWidth>0</wp14:pctWidth>
-                  </wp14:sizeRelH>
-                  <wp14:sizeRelV relativeFrom="page">
-                    <wp14:pctHeight>0</wp14:pctHeight>
-                  </wp14:sizeRelV>
-                </wp:anchor>
+                <ns3:anchor distT="0" distB="0" distL="114300" distR="114300" simplePos="0" relativeHeight="251660800" behindDoc="0" locked="0" layoutInCell="1" allowOverlap="1" ns4:anchorId="29B5D335" ns4:editId="2E64544F">
+                  <ns3:simplePos x="0" y="0"/>
+                  <ns3:positionH relativeFrom="column">
+                    <ns3:posOffset>0</ns3:posOffset>
+                  </ns3:positionH>
+                  <ns3:positionV relativeFrom="paragraph">
+                    <ns3:posOffset>116006</ns3:posOffset>
+                  </ns3:positionV>
+                  <ns3:extent cx="1201003" cy="1201003"/>
+                  <ns3:effectExtent l="0" t="0" r="0" b="0"/>
+                  <ns3:wrapNone/>
+                  <ns3:docPr id="2020212982" name="Picture 1"/>
+                  <ns3:cNvGraphicFramePr>
+                    <ns5:graphicFrameLocks noChangeAspect="1"/>
+                  </ns3:cNvGraphicFramePr>
+                  <ns5:graphic>
+                    <ns5:graphicData uri="http://schemas.openxmlformats.org/drawingml/2006/picture">
+                      <ns6:pic>
+                        <ns6:nvPicPr>
+                          <ns6:cNvPr id="0" name="Picture 1"/>
+                          <ns6:cNvPicPr>
+                            <ns5:picLocks noChangeAspect="1" noChangeArrowheads="1"/>
+                          </ns6:cNvPicPr>
+                        </ns6:nvPicPr>
+                        <ns6:blipFill>
+                          <ns5:blip ns7:embed="rId6">
+                            <ns5:extLst>
+                              <ns5:ext uri="{28A0092B-C50C-407E-A947-70E740481C1C}">
+                                <ns8:useLocalDpi val="0"/>
+                              </ns5:ext>
+                            </ns5:extLst>
+                          </ns5:blip>
+                          <ns5:srcRect/>
+                          <ns5:stretch>
+                            <ns5:fillRect/>
+                          </ns5:stretch>
+                        </ns6:blipFill>
+                        <ns6:spPr bwMode="auto">
+                          <ns5:xfrm>
+                            <ns5:off x="0" y="0"/>
+                            <ns5:ext cx="1203370" cy="1203370"/>
+                          </ns5:xfrm>
+                          <ns5:prstGeom prst="rect">
+                            <ns5:avLst/>
+                          </ns5:prstGeom>
+                          <ns5:noFill/>
+                          <ns5:ln>
+                            <ns5:noFill/>
+                          </ns5:ln>
+                        </ns6:spPr>
+                      </ns6:pic>
+                    </ns5:graphicData>
+                  </ns5:graphic>
+                  <ns4:sizeRelH relativeFrom="page">
+                    <ns4:pctWidth>0</ns4:pctWidth>
+                  </ns4:sizeRelH>
+                  <ns4:sizeRelV relativeFrom="page">
+                    <ns4:pctHeight>0</ns4:pctHeight>
+                  </ns4:sizeRelV>
+                </ns3:anchor>
               </w:drawing>
             </w:r>
           </w:p>
-          <w:p/>
-          <w:p>
+          <w:p ns2:paraId="20138419" ns2:textId="77777777"/>
+          <w:p ns2:paraId="27BF85BB" ns2:textId="77777777">
             <w:pPr>
               <w:spacing w:before="120" w:after="40"/>
             </w:pPr>
@@ -105,7 +105,7 @@
             <w:tblGrid>
               <w:gridCol w:w="1890"/>
             </w:tblGrid>
-            <w:tr>
+            <w:tr ns2:paraId="5227CCAB" ns2:textId="77777777">
               <w:tc>
                 <w:tcPr>
                   <w:tcW w:w="2224" w:type="dxa"/>
@@ -117,7 +117,7 @@
                     <w:right w:w="140" w:type="dxa"/>
                   </w:tcMar>
                 </w:tcPr>
-                <w:p>
+                <w:p ns2:paraId="797A17D1" ns2:textId="77777777">
                   <w:pPr>
                     <w:spacing w:after="80"/>
                   </w:pPr>
@@ -131,7 +131,7 @@
                     <w:t>EDUCATION &amp; CREDENTIALS</w:t>
                   </w:r>
                 </w:p>
-                <w:p>
+                <w:p ns2:paraId="5BF0B8AA" ns2:textId="77777777">
                   <w:pPr>
                     <w:spacing w:after="70"/>
                   </w:pPr>
@@ -161,7 +161,7 @@
                     <w:t>August 28, 2000</w:t>
                   </w:r>
                 </w:p>
-                <w:p>
+                <w:p ns2:paraId="3CE948D2" ns2:textId="6BA08E97">
                   <w:pPr>
                     <w:spacing w:after="70"/>
                   </w:pPr>
@@ -199,7 +199,7 @@
                     <w:t xml:space="preserve">nformatics Baguio. </w:t>
                   </w:r>
                 </w:p>
-                <w:p>
+                <w:p ns2:paraId="51840E5C" ns2:textId="77777777">
                   <w:pPr>
                     <w:spacing w:after="70"/>
                   </w:pPr>
@@ -232,13 +232,177 @@
               </w:tc>
             </w:tr>
           </w:tbl>
-          <w:p/>
+          <w:p ns2:paraId="5BE38F84" ns2:textId="77777777"/>
+          <w:p>
+            <w:pPr>
+              <w:spacing w:before="140" w:after="80"/>
+            </w:pPr>
+            <w:r>
+              <w:rPr>
+                <w:rFonts w:ascii="Arial" w:hAnsi="Arial"/>
+                <w:b/>
+                <w:color w:val="5A3214"/>
+                <w:sz w:val="18"/>
+              </w:rPr>
+              <w:t>CONTACT INFORMATION</w:t>
+            </w:r>
+          </w:p>
+          <w:p>
+            <w:pPr>
+              <w:spacing w:after="60"/>
+            </w:pPr>
+            <w:r>
+              <w:rPr>
+                <w:b/>
+                <w:color w:val="8C461E"/>
+                <w:sz w:val="16"/>
+              </w:rPr>
+              <w:t xml:space="preserve">▪ </w:t>
+            </w:r>
+            <w:r>
+              <w:rPr>
+                <w:rFonts w:ascii="Arial" w:hAnsi="Arial"/>
+                <w:b/>
+                <w:color w:val="282828"/>
+                <w:sz w:val="16"/>
+              </w:rPr>
+              <w:t xml:space="preserve">Phone / Mobile: </w:t>
+            </w:r>
+            <w:r>
+              <w:rPr>
+                <w:rFonts w:ascii="Arial" w:hAnsi="Arial"/>
+                <w:color w:val="3C3C3C"/>
+                <w:sz w:val="16"/>
+              </w:rPr>
+              <w:t>19859251674</w:t>
+            </w:r>
+          </w:p>
+          <w:p>
+            <w:pPr>
+              <w:spacing w:after="60"/>
+            </w:pPr>
+            <w:r>
+              <w:rPr>
+                <w:b/>
+                <w:color w:val="8C461E"/>
+                <w:sz w:val="16"/>
+              </w:rPr>
+              <w:t xml:space="preserve">▪ </w:t>
+            </w:r>
+            <w:r>
+              <w:rPr>
+                <w:rFonts w:ascii="Arial" w:hAnsi="Arial"/>
+                <w:b/>
+                <w:color w:val="282828"/>
+                <w:sz w:val="16"/>
+              </w:rPr>
+              <w:t xml:space="preserve">Facebook: </w:t>
+            </w:r>
+            <w:r>
+              <w:rPr>
+                <w:rFonts w:ascii="Arial" w:hAnsi="Arial"/>
+                <w:color w:val="3C3C3C"/>
+                <w:sz w:val="16"/>
+              </w:rPr>
+              <w:t>https://www.facebook.com/KKharold28</w:t>
+            </w:r>
+          </w:p>
+          <w:p>
+            <w:pPr>
+              <w:spacing w:after="60"/>
+            </w:pPr>
+            <w:r>
+              <w:rPr>
+                <w:b/>
+                <w:color w:val="8C461E"/>
+                <w:sz w:val="16"/>
+              </w:rPr>
+              <w:t xml:space="preserve">▪ </w:t>
+            </w:r>
+            <w:r>
+              <w:rPr>
+                <w:rFonts w:ascii="Arial" w:hAnsi="Arial"/>
+                <w:b/>
+                <w:color w:val="282828"/>
+                <w:sz w:val="16"/>
+              </w:rPr>
+              <w:t xml:space="preserve">Direct Email: </w:t>
+            </w:r>
+            <w:r>
+              <w:rPr>
+                <w:rFonts w:ascii="Arial" w:hAnsi="Arial"/>
+                <w:color w:val="3C3C3C"/>
+                <w:sz w:val="16"/>
+              </w:rPr>
+              <w:t>hroldmallorca@gmail.com</w:t>
+            </w:r>
+          </w:p>
+          <w:p>
+            <w:pPr>
+              <w:spacing w:after="60"/>
+            </w:pPr>
+            <w:r>
+              <w:rPr>
+                <w:b/>
+                <w:color w:val="8C461E"/>
+                <w:sz w:val="16"/>
+              </w:rPr>
+              <w:t xml:space="preserve">▪ </w:t>
+            </w:r>
+            <w:r>
+              <w:rPr>
+                <w:rFonts w:ascii="Arial" w:hAnsi="Arial"/>
+                <w:b/>
+                <w:color w:val="282828"/>
+                <w:sz w:val="16"/>
+              </w:rPr>
+              <w:t xml:space="preserve">GitHub Profile: </w:t>
+            </w:r>
+            <w:r>
+              <w:rPr>
+                <w:rFonts w:ascii="Arial" w:hAnsi="Arial"/>
+                <w:color w:val="3C3C3C"/>
+                <w:sz w:val="16"/>
+              </w:rPr>
+              <w:t>https://github.com/Hrolds</w:t>
+            </w:r>
+          </w:p>
+          <w:p>
+            <w:pPr>
+              <w:spacing w:after="60"/>
+            </w:pPr>
+            <w:r>
+              <w:rPr>
+                <w:b/>
+                <w:color w:val="8C461E"/>
+                <w:sz w:val="16"/>
+              </w:rPr>
+              <w:t xml:space="preserve">▪ </w:t>
+            </w:r>
+            <w:r>
+              <w:rPr>
+                <w:rFonts w:ascii="Arial" w:hAnsi="Arial"/>
+                <w:b/>
+                <w:color w:val="282828"/>
+                <w:sz w:val="16"/>
+              </w:rPr>
+              <w:t xml:space="preserve">Portfolio Site: </w:t>
+            </w:r>
+            <w:r>
+              <w:rPr>
+                <w:rFonts w:ascii="Arial" w:hAnsi="Arial"/>
+                <w:color w:val="3C3C3C"/>
+                <w:sz w:val="16"/>
+              </w:rPr>
+              <w:t>https://hrolds.github.io/</w:t>
+            </w:r>
+          </w:p>
         </w:tc>
         <w:tc>
           <w:tcPr>
             <w:tcW w:w="7344" w:type="dxa"/>
           </w:tcPr>
-          <w:p>
+          <w:p ns2:paraId="44059B29" ns2:textId="020A0495">
             <w:pPr>
               <w:spacing w:after="20"/>
             </w:pPr>
@@ -252,7 +416,7 @@
               <w:t>HAROLD P. MALLORCA</w:t>
             </w:r>
           </w:p>
-          <w:p>
+          <w:p ns2:paraId="261E566D" ns2:textId="77777777">
             <w:pPr>
               <w:spacing w:after="80"/>
             </w:pPr>
@@ -265,7 +429,7 @@
               <w:t>APPLICANT BIOGRAPHY &amp; TECHNICAL PROFILE</w:t>
             </w:r>
           </w:p>
-          <w:p>
+          <w:p ns2:paraId="74E667F7" ns2:textId="77777777">
             <w:pPr>
               <w:spacing w:after="120"/>
             </w:pPr>
@@ -278,7 +442,7 @@
               <w:t>——————————————————————————————————————</w:t>
             </w:r>
           </w:p>
-          <w:p>
+          <w:p ns2:paraId="462F5CCD" ns2:textId="77777777">
             <w:pPr>
               <w:spacing w:after="50"/>
             </w:pPr>
@@ -308,7 +472,7 @@
               <w:t>Systems Administrator Assistant / Developer</w:t>
             </w:r>
           </w:p>
-          <w:p>
+          <w:p ns2:paraId="2207F7DF" ns2:textId="77777777">
             <w:pPr>
               <w:spacing w:after="50"/>
             </w:pPr>
@@ -338,7 +502,7 @@
               <w:t>City Human Resource Management Office (CHRMO), Baguio City Hall</w:t>
             </w:r>
           </w:p>
-          <w:p>
+          <w:p ns2:paraId="26BCDFDC" ns2:textId="77777777">
             <w:pPr>
               <w:spacing w:after="50"/>
             </w:pPr>
@@ -368,7 +532,7 @@
               <w:t>October 27, 2022 – Present</w:t>
             </w:r>
           </w:p>
-          <w:p>
+          <w:p ns2:paraId="36E4B717" ns2:textId="77777777">
             <w:pPr>
               <w:spacing w:after="50"/>
             </w:pPr>
@@ -398,7 +562,7 @@
               <w:t>Expanded Tertiary Education Equivalency &amp; Accreditation Program (ETEEAP)</w:t>
             </w:r>
           </w:p>
-          <w:p>
+          <w:p ns2:paraId="7F50C1B9" ns2:textId="77777777">
             <w:pPr>
               <w:spacing w:before="120" w:after="40"/>
             </w:pPr>
@@ -412,7 +576,7 @@
               <w:t>PROFILE SUMMARY</w:t>
             </w:r>
           </w:p>
-          <w:p>
+          <w:p ns2:paraId="5824C447" ns2:textId="77777777">
             <w:pPr>
               <w:spacing w:after="120"/>
             </w:pPr>
@@ -422,10 +586,10 @@
                 <w:color w:val="3C3C3C"/>
                 <w:sz w:val="17"/>
               </w:rPr>
-              <w:t>IT practitioner and software developer with 4 years of continuous service at the City Government of Baguio. Specializes in full-stack web applications, database management, and biometric hardware integration. Applying for ETEEAP to formally earn a Bachelor of Science in Information Technology (BSIT) based on demonstrated field competencies.</w:t>
+              <w:t>Focused on customizing and automating software solutions to meet company needs and improve daily operations. IT practitioner and developer with 4 years of continuous service at the City Government of Baguio. Specializes in full-stack web applications, database management, and biometric hardware integration. Applying for ETEEAP to formally earn a Bachelor of Science in Information Technology (BSIT) based on demonstrated field competencies.</w:t>
             </w:r>
           </w:p>
-          <w:p>
+          <w:p ns2:paraId="158AAB31" ns2:textId="77777777">
             <w:pPr>
               <w:spacing w:before="80" w:after="40"/>
             </w:pPr>
@@ -439,7 +603,7 @@
               <w:t>CORE TECHNICAL SKILLS</w:t>
             </w:r>
           </w:p>
-          <w:p>
+          <w:p ns2:paraId="03D630A6" ns2:textId="77777777">
             <w:pPr>
               <w:spacing w:after="50"/>
             </w:pPr>
@@ -469,7 +633,7 @@
               <w:t>C#, Blazor (Server/WebAssembly), JavaScript, HTML5, CSS3, Tailwind CSS, MudBlazor</w:t>
             </w:r>
           </w:p>
-          <w:p>
+          <w:p ns2:paraId="4B150C79" ns2:textId="3EDC6938">
             <w:pPr>
               <w:spacing w:after="50"/>
             </w:pPr>
@@ -543,7 +707,7 @@
             </w:r>
             <w:proofErr w:type="spellEnd"/>
           </w:p>
-          <w:p>
+          <w:p ns2:paraId="018C5255" ns2:textId="77777777">
             <w:pPr>
               <w:spacing w:after="50"/>
             </w:pPr>
@@ -573,7 +737,7 @@
               <w:t>ZKTeco Biometrics, Wacom STU-540 Signature Pads, Router/LAN Configuration</w:t>
             </w:r>
           </w:p>
-          <w:p>
+          <w:p ns2:paraId="7F3F2838" ns2:textId="080FCF5A">
             <w:pPr>
               <w:spacing w:after="50"/>
             </w:pPr>
@@ -630,7 +794,7 @@
         </w:tc>
       </w:tr>
     </w:tbl>
-    <w:p>
+    <w:p ns2:paraId="7EE37F51" ns2:textId="77777777">
       <w:pPr>
         <w:spacing w:before="160" w:after="60"/>
       </w:pPr>
@@ -644,7 +808,7 @@
         <w:t>SYSTEMS DEVELOPED</w:t>
       </w:r>
     </w:p>
-    <w:p>
+    <w:p ns2:paraId="069DABDC" ns2:textId="77777777">
       <w:pPr>
         <w:spacing w:after="60"/>
         <w:ind w:left="288"/>
@@ -675,7 +839,7 @@
         <w:t>Web portal utilizing Firebase and Supabase for employee registration, incident tracking, and real-time database storage.</w:t>
       </w:r>
     </w:p>
-    <w:p>
+    <w:p ns2:paraId="502BA46E" ns2:textId="0F4718F7">
       <w:pPr>
         <w:spacing w:after="60"/>
         <w:ind w:left="288"/>
@@ -711,7 +875,7 @@
         <w:t>Specialized software layer connecting physical devices (ZKTeco biometric fingerprint/face scanners and Wacom STU-540 digital signature pads) to web applications.</w:t>
       </w:r>
     </w:p>
-    <w:p>
+    <w:p ns2:paraId="40E39569" ns2:textId="33A32AB0">
       <w:pPr>
         <w:spacing w:after="60"/>
         <w:ind w:left="288"/>
@@ -739,7 +903,7 @@
         <w:t xml:space="preserve">Automation of Endorsement. </w:t>
       </w:r>
     </w:p>
-    <w:p>
+    <w:p ns2:paraId="70D77472" ns2:textId="4C1B9CF6">
       <w:pPr>
         <w:spacing w:before="160" w:after="60"/>
       </w:pPr>
@@ -771,7 +935,7 @@
         <w:t xml:space="preserve"> MANAGED &amp; OPERATED</w:t>
       </w:r>
     </w:p>
-    <w:p>
+    <w:p ns2:paraId="149B3DF7" ns2:textId="6BA322A9">
       <w:pPr>
         <w:spacing w:after="60"/>
         <w:ind w:left="288"/>
@@ -834,7 +998,7 @@
         <w:t>.</w:t>
       </w:r>
     </w:p>
-    <w:p>
+    <w:p ns2:paraId="22A4ECA5" ns2:textId="550B64E3">
       <w:pPr>
         <w:spacing w:after="60"/>
         <w:ind w:left="288"/>
@@ -884,7 +1048,7 @@
         <w:t>Managed user access permissions and maintained master 201 employee records.</w:t>
       </w:r>
     </w:p>
-    <w:p>
+    <w:p ns2:paraId="2C174D76" ns2:textId="170601D1">
       <w:pPr>
         <w:spacing w:after="60"/>
         <w:ind w:left="288"/>
@@ -923,7 +1087,7 @@
         <w:t xml:space="preserve"> LAN/WLAN connections, router configs, signature pad drivers, and hardware diagnostics within the department.</w:t>
       </w:r>
     </w:p>
-    <w:p>
+    <w:p ns2:paraId="15036157" ns2:textId="77777777">
       <w:pPr>
         <w:spacing w:before="160" w:after="60"/>
       </w:pPr>
@@ -937,7 +1101,7 @@
         <w:t>SYSTEMS CURRENTLY UNDER DEVELOPMENT</w:t>
       </w:r>
     </w:p>
-    <w:p>
+    <w:p ns2:paraId="24905439" ns2:textId="675C60E0">
       <w:pPr>
         <w:spacing w:after="60"/>
         <w:ind w:left="288"/>
@@ -973,7 +1137,7 @@
         <w:t>Automated background to sync multi-terminal biometric logs directly into the central ePayroll database in real time.</w:t>
       </w:r>
     </w:p>
-    <w:p>
+    <w:p ns2:paraId="561AAF2A" ns2:textId="58BEAFDB">
       <w:pPr>
         <w:spacing w:after="60"/>
         <w:ind w:left="288"/>
@@ -1017,7 +1181,7 @@
         <w:t>.</w:t>
       </w:r>
     </w:p>
-    <w:p>
+    <w:p ns2:paraId="46E30D88" ns2:textId="39AF2071">
       <w:pPr>
         <w:spacing w:after="60"/>
         <w:ind w:left="288"/>
@@ -1063,13 +1227,13 @@
         <w:t>:</w:t>
       </w:r>
     </w:p>
-    <w:p>
+    <w:p ns2:paraId="490913A4" ns2:textId="77777777">
       <w:pPr>
         <w:spacing w:after="60"/>
         <w:ind w:left="288"/>
       </w:pPr>
     </w:p>
-    <w:p>
+    <w:p ns2:paraId="4FFBD48A" ns2:textId="77777777">
       <w:pPr>
         <w:spacing w:before="160" w:after="60"/>
       </w:pPr>
@@ -1083,7 +1247,7 @@
         <w:t>PURPOSE &amp; GOAL FOR ETEEAP</w:t>
       </w:r>
     </w:p>
-    <w:p>
+    <w:p ns2:paraId="0B159711" ns2:textId="77777777">
       <w:pPr>
         <w:ind w:left="288"/>
         <w:rPr>
@@ -1101,12 +1265,12 @@
         <w:t>To validate and accredit 4+ years of professional software engineering and systems administration experience under CHED tertiary standards, earning a Bachelor of Science in Information Technology (BSIT) to qualify for higher technical civil service ranks and long-term public sector technology leadership.</w:t>
       </w:r>
     </w:p>
-    <w:p>
+    <w:p ns2:paraId="0B531E3C" ns2:textId="77777777">
       <w:pPr>
         <w:ind w:left="288"/>
       </w:pPr>
     </w:p>
-    <w:p>
+    <w:p ns2:paraId="56510DFD" ns2:textId="77777777">
       <w:pPr>
         <w:spacing w:before="160"/>
       </w:pPr>

</xml_diff>